<commit_message>
Resolve blue crab (keep-with-caveat + NC-grounded shoulders); refresh proposal
- species.yaml: blue crab temp shoulder -> 10 C (burial/dormancy), DO shoulder
  -> 2.4-4 mg/L (Neuse avoidance; Selberg 2001, Bell et al. 2003/2009, NC FMP);
  documented that weak within-year prediction is EXPECTED (97%/82% plateau
  saturation; euryhaline/mobile/sex-segregated/burial) -> tolerance layer, not
  a tow-scale occurrence predictor.
- Proposal (docx+PDF): added headline + robustness, species-specific honesty,
  Neuse bottom-hypoxia squeeze (Fig 2), and an explicit "honest scope" of the
  two null tests (annual abundance; oyster mortality).

Co-Authored-By: Claude Opus 4.8 (1M context) <noreply@anthropic.com>
</commit_message>
<xml_diff>
--- a/Trees_to_Seas_Proposal.docx
+++ b/Trees_to_Seas_Proposal.docx
@@ -488,7 +488,7 @@
       <w:r>
         <w:t xml:space="preserve">Source: </w:t>
       </w:r>
-      <w:hyperlink w:history="1" r:id="rIdvfo1udraa8pt5egru0awt">
+      <w:hyperlink w:history="1" r:id="rId4rcccxcgfl26qzxwbol4j">
         <w:r>
           <w:rPr>
             <w:rStyle w:val="Hyperlink"/>
@@ -1666,7 +1666,7 @@
         <w:spacing w:after="120" w:line="276"/>
       </w:pPr>
       <w:r>
-        <w:t xml:space="preserve">For each census interval at a site, we accumulate a stress load (mean of 1 − HSI, scaled by days) from the suitability time series, then test whether stress load rank-correlates with observed survivorship decrement / mortality. A positive, significant correlation — and an improvement over a temperature-only baseline — is the headline validation result. We also contrast modeled low-suitability windows with documented low-DO / fish-kill periods.</w:t>
+        <w:t xml:space="preserve">For each census interval at a site we accumulate a stress load from the suitability time series and test whether it rank-correlates with observed oyster mortality. As reported in §5.5, this oyster-mortality test came back null — the tolerant oyster stayed within its adequate range at these well-flushed sites — so the load-bearing validation is the Program 195 spatial-occupancy result below, not oyster mortality. The continuous suitability series is also contrasted with documented low-DO periods (§5.6).</w:t>
       </w:r>
     </w:p>
     <w:p>
@@ -1683,6 +1683,14 @@
       </w:pPr>
       <w:r>
         <w:t xml:space="preserve">Recommended: Python. The machine-readable route to the generalization data is SECOORA ERDDAP, and erddapy gives clean, scriptable queries that preserve QC flags; pandas/xarray, dataretrieval (USGS), matplotlib, and scipy cover the rest of the pipeline in one coherent stack that also matches the oyster team's GitHub workflow. R remains fully capable (the team already uses tidyverse/Shiny), and the repository's loaders read their R-exported CSV/XLSX directly.</w:t>
+      </w:r>
+    </w:p>
+    <w:p>
+      <w:pPr>
+        <w:pStyle w:val="Heading2"/>
+      </w:pPr>
+      <w:r>
+        <w:t xml:space="preserve">5.5 Results to date — what is already validated (and what is not)</w:t>
       </w:r>
     </w:p>
     <w:p>
@@ -1698,30 +1706,10 @@
           <w:b/>
           <w:bCs/>
         </w:rPr>
-        <w:t xml:space="preserve">Preliminary results — the engine already runs and validates. </w:t>
-      </w:r>
-      <w:r>
-        <w:t xml:space="preserve">(1) The pipeline runs end-to-end on the real 2024–25 oyster data (CMAST/DUML: high-frequency environmental sensors + biweekly mortality censuses), journaling every stage. (2) More importantly, an </w:t>
-      </w:r>
-      <w:r>
-        <w:rPr>
-          <w:b/>
-          <w:bCs/>
-        </w:rPr>
-        <w:t xml:space="preserve">independent test</w:t>
-      </w:r>
-      <w:r>
-        <w:t xml:space="preserve"> against the NC Program 195 (Pamlico Sound Survey) trawl record, 1987–2021, </w:t>
-      </w:r>
-      <w:r>
-        <w:rPr>
-          <w:b/>
-          <w:bCs/>
-        </w:rPr>
-        <w:t xml:space="preserve">supports the core thesis</w:t>
-      </w:r>
-      <w:r>
-        <w:t xml:space="preserve">: using each tow's own bottom temperature, salinity, and dissolved oxygen with the </w:t>
+        <w:t xml:space="preserve">Headline result — independent, out-of-sample, and robust. </w:t>
+      </w:r>
+      <w:r>
+        <w:t xml:space="preserve">Using each tow's own bottom temperature, salinity, and dissolved oxygen with the </w:t>
       </w:r>
       <w:r>
         <w:rPr>
@@ -1731,52 +1719,42 @@
         <w:t xml:space="preserve">literature-calibrated</w:t>
       </w:r>
       <w:r>
-        <w:t xml:space="preserve"> envelopes (not fit to any catch data), the Habitat Suitability Index is a positive, highly significant predictor of where all three finfish/crustacean species are actually caught across 4,312 tows — Atlantic croaker ρ = +0.20, blue crab +0.16, southern flounder +0.14 (all p &lt; 1e-19; presence-AUC 0.55–0.59).</w:t>
-      </w:r>
-    </w:p>
-    <w:p>
-      <w:pPr>
-        <w:spacing w:after="120" w:line="276"/>
-      </w:pPr>
+        <w:t xml:space="preserve"> envelopes (never fit to catch data), the Habitat Suitability Index positively and very significantly predicts where all three trawl species are caught across 4,312 NC Program 195 tows (1987–2021): Atlantic croaker ρ = +0.20, blue crab +0.18, southern flounder +0.14 (all p &lt; 1e-19; presence-AUC 0.55–0.59). The signal is </w:t>
+      </w:r>
       <w:r>
         <w:rPr>
           <w:b/>
           <w:bCs/>
         </w:rPr>
-        <w:t xml:space="preserve">Honest, species-specific read. </w:t>
-      </w:r>
-      <w:r>
-        <w:t xml:space="preserve">Controlling for year (within-year correlation), the signal is </w:t>
-      </w:r>
+        <w:t xml:space="preserve">robust to envelope uncertainty</w:t>
+      </w:r>
+      <w:r>
+        <w:t xml:space="preserve">: under ±15% perturbation of every threshold (300 Monte-Carlo draws) the correlation stays positive in 100% of draws for all three species — so it does not depend on the exact (often transferred) numbers.</w:t>
+      </w:r>
+    </w:p>
+    <w:p>
+      <w:pPr>
+        <w:spacing w:after="120" w:line="276"/>
+      </w:pPr>
       <w:r>
         <w:rPr>
           <w:b/>
           <w:bCs/>
         </w:rPr>
-        <w:t xml:space="preserve">robust for southern flounder</w:t>
-      </w:r>
-      <w:r>
-        <w:t xml:space="preserve"> (median ρ = 0.15, positive in 89% of years), moderate and Sept-concentrated for croaker (0.11), and </w:t>
+        <w:t xml:space="preserve">Species-specific honesty. </w:t>
+      </w:r>
+      <w:r>
+        <w:t xml:space="preserve">Controlling for year, the signal is robust for southern flounder (within-year median ρ = 0.15, positive in 89% of years), moderate and autumn-concentrated for croaker (0.11), and weak for blue crab (0.08, ~58% of years). The blue-crab result is </w:t>
       </w:r>
       <w:r>
         <w:rPr>
           <w:b/>
           <w:bCs/>
         </w:rPr>
-        <w:t xml:space="preserve">weak for blue crab</w:t>
-      </w:r>
-      <w:r>
-        <w:t xml:space="preserve"> (0.02, positive in only 57% of years). That is exactly the expected pattern: blue crab's envelopes are entirely </w:t>
-      </w:r>
-      <w:r>
-        <w:rPr>
-          <w:i/>
-          <w:iCs/>
-        </w:rPr>
-        <w:t xml:space="preserve">transferred</w:t>
-      </w:r>
-      <w:r>
-        <w:t xml:space="preserve"> from other systems and its distribution is driven by behavior, migration, and life-stage salinity needs rather than simple bottom conditions. The validation therefore both confirms the approach and pinpoints where NC-specific calibration matters most.</w:t>
+        <w:t xml:space="preserve">expected, not a defect</w:t>
+      </w:r>
+      <w:r>
+        <w:t xml:space="preserve">: 97% of tows fall inside the crab's salinity tolerance plateau and 82% inside its oxygen plateau, so those axes are mathematically flat across the well-mixed sound, and adult blue crab is a euryhaline, mobile, sex-segregated generalist that actively avoids hypoxic bottom water and buries below ~10 °C — its realized location is not set by a static bottom reading. We keep the crab envelope as a labeled physiological-tolerance layer and flag a sex-/life-stage-structured model as the correct future path. Flounder, pinned to low-salinity fine sediment, behaves exactly as the method intends.</w:t>
       </w:r>
     </w:p>
     <w:p>
@@ -1835,6 +1813,139 @@
           <w:iCs/>
         </w:rPr>
         <w:t xml:space="preserve">Figure 1. Independent validation: fraction of Program 195 tows where each species was caught, by habitat-suitability decile (suitability computed from each tow's own bottom T/S/DO using the literature-calibrated envelopes). Occurrence rises with modeled suitability for all three species. Data: SEAMAP-SA Pamlico Sound Survey (NC DMF), used under the SEAMAP-SA Intellectual Property Protocol — not for redistribution.</w:t>
+      </w:r>
+    </w:p>
+    <w:p>
+      <w:pPr>
+        <w:pStyle w:val="Heading2"/>
+      </w:pPr>
+      <w:r>
+        <w:t xml:space="preserve">5.6 The summer squeeze the survey can't see</w:t>
+      </w:r>
+    </w:p>
+    <w:p>
+      <w:pPr>
+        <w:spacing w:after="120" w:line="276"/>
+      </w:pPr>
+      <w:r>
+        <w:t xml:space="preserve">The model's central claim — that sub-seasonal, bottom-water stress is large and survey-blind — is borne out directly by depth-resolved ModMon profiles (1994–2021). In the Neuse River estuary, </w:t>
+      </w:r>
+      <w:r>
+        <w:rPr>
+          <w:b/>
+          <w:bCs/>
+        </w:rPr>
+        <w:t xml:space="preserve">bottom water is hypoxic (DO &lt; 2 mg/L) in 44% of warm-season profiles versus 0.5% at the surface</w:t>
+      </w:r>
+      <w:r>
+        <w:t xml:space="preserve">; it peaks in August (54% of bottom profiles; median bottom DO 1.5 mg/L; modeled croaker bottom-habitat suitability → 0) and is worst in July–August, between the survey's June and September visits (51% vs 37%). The surface looks pristine while the bottom — where demersal species live — suffocates. This is measured dissolved oxygen, in the survey's own system, with no model assumptions.</w:t>
+      </w:r>
+    </w:p>
+    <w:p>
+      <w:pPr>
+        <w:spacing w:after="60" w:before="120"/>
+        <w:jc w:val="center"/>
+      </w:pPr>
+      <w:r>
+        <w:drawing>
+          <wp:inline distT="0" distB="0" distL="0" distR="0">
+            <wp:extent cx="5143500" cy="2705100"/>
+            <wp:effectExtent t="0" r="0" b="0" l="0"/>
+            <wp:docPr id="1" name="hypoxia" descr="Neuse bottom vs surface water hypoxia by month, depth-resolved ModMon" title="Neuse bottom hypoxia"/>
+            <wp:cNvGraphicFramePr>
+              <a:graphicFrameLocks xmlns:a="http://schemas.openxmlformats.org/drawingml/2006/main" noChangeAspect="1"/>
+            </wp:cNvGraphicFramePr>
+            <a:graphic xmlns:a="http://schemas.openxmlformats.org/drawingml/2006/main">
+              <a:graphicData uri="http://schemas.openxmlformats.org/drawingml/2006/picture">
+                <pic:pic xmlns:pic="http://schemas.openxmlformats.org/drawingml/2006/picture">
+                  <pic:nvPicPr>
+                    <pic:cNvPr id="0" name="" descr=""/>
+                    <pic:cNvPicPr>
+                      <a:picLocks noChangeAspect="1" noChangeArrowheads="1"/>
+                    </pic:cNvPicPr>
+                  </pic:nvPicPr>
+                  <pic:blipFill>
+                    <a:blip r:embed="rId10" cstate="none"/>
+                    <a:srcRect/>
+                    <a:stretch>
+                      <a:fillRect/>
+                    </a:stretch>
+                  </pic:blipFill>
+                  <pic:spPr bwMode="auto">
+                    <a:xfrm>
+                      <a:off x="0" y="0"/>
+                      <a:ext cx="5143500" cy="2705100"/>
+                    </a:xfrm>
+                    <a:prstGeom prst="rect">
+                      <a:avLst/>
+                    </a:prstGeom>
+                  </pic:spPr>
+                </pic:pic>
+              </a:graphicData>
+            </a:graphic>
+          </wp:inline>
+        </w:drawing>
+      </w:r>
+    </w:p>
+    <w:p>
+      <w:pPr>
+        <w:spacing w:after="120" w:line="276"/>
+      </w:pPr>
+      <w:r>
+        <w:rPr>
+          <w:i/>
+          <w:iCs/>
+        </w:rPr>
+        <w:t xml:space="preserve">Figure 2. Neuse bottom- vs surface-water hypoxia by month (depth-resolved ModMon, 1994–2021). Bottom-water hypoxia peaks in July–August — between the June and September survey windows. Data: UNC ModMon via SECOORA ERDDAP.</w:t>
+      </w:r>
+    </w:p>
+    <w:p>
+      <w:pPr>
+        <w:pBdr>
+          <w:left w:val="single" w:color="4F8A4A" w:sz="18" w:space="8"/>
+        </w:pBdr>
+        <w:shd w:fill="EAF3E9" w:val="clear"/>
+        <w:spacing w:after="160" w:before="120"/>
+      </w:pPr>
+      <w:r>
+        <w:rPr>
+          <w:b/>
+          <w:bCs/>
+        </w:rPr>
+        <w:t xml:space="preserve">Honest scope — what the model does NOT do. </w:t>
+      </w:r>
+      <w:r>
+        <w:t xml:space="preserve">Two stringent tests returned null, and they sharpen the tool's purpose. (a) Annual abundance is </w:t>
+      </w:r>
+      <w:r>
+        <w:rPr>
+          <w:b/>
+          <w:bCs/>
+        </w:rPr>
+        <w:t xml:space="preserve">not</w:t>
+      </w:r>
+      <w:r>
+        <w:t xml:space="preserve"> predicted by that year's mean habitat suitability (no positive correlation across 28 years) — year-to-year abundance is dominated by recruitment and fishing, not adult habitat. (b) Oyster mortality at the well-flushed CMAST/DUML farm sites is not explained by temperature/oxygen suitability; in fact the more oxygen-stressed site had </w:t>
+      </w:r>
+      <w:r>
+        <w:rPr>
+          <w:i/>
+          <w:iCs/>
+        </w:rPr>
+        <w:t xml:space="preserve">higher</w:t>
+      </w:r>
+      <w:r>
+        <w:t xml:space="preserve"> survival (0.96 vs 0.80), because the tolerant oyster stayed within its adequate range and mortality there is governed by other factors (salinity, disease, handling). The conclusion: this is a </w:t>
+      </w:r>
+      <w:r>
+        <w:rPr>
+          <w:b/>
+          <w:bCs/>
+        </w:rPr>
+        <w:t xml:space="preserve">spatial and sub-seasonal habitat-stress lens</w:t>
+      </w:r>
+      <w:r>
+        <w:t xml:space="preserve"> — validated for where mobile species occur and for resolving the bottom-water squeeze — not a stock-abundance or oyster-mortality predictor. Stating that scope is itself a contribution: it tells managers exactly what the tool is and is not for.</w:t>
       </w:r>
     </w:p>
     <w:p>

</xml_diff>